<commit_message>
Fix cppdemo crash (RW bss segment) + autostart args/extension dispatch
- user.ld: force two LOAD segments via explicit PHDRS (RX text/rodata, RW data/bss).
  C++ apps whose writable globals are all zero-init have no .data, so the linker had
  folded .bss into the single RWE segment; the loader maps a PF_X segment read-only,
  so the first global write faulted (cppdemo crashed in its ctor / first `new`). Now
  .bss always sits in a writable (no-PF_X) segment. C apps are unchanged (same split).
- autostart.txt: each line is now "<name>[.app] [args...]". A ".app" name -> desktop
  app /apps/<name>/main.elf; no extension -> /bin console tool /bin/<name>.elf; the
  rest is argv (e.g. "keyb FR"). StartAutostart parses + dispatches via ExecPath.
- Docs/exports updated.

Co-Authored-By: Claude Opus 4.8 <noreply@anthropic.com>
</commit_message>
<xml_diff>
--- a/docs/exports/04-USER-GUIDE.docx
+++ b/docs/exports/04-USER-GUIDE.docx
@@ -7561,28 +7561,106 @@
         <w:t xml:space="preserve">SD:apps/autostart.txt</w:t>
       </w:r>
       <w:r>
-        <w:t xml:space="preserve">: one app per line, launched at boot (folder name without</w:t>
-      </w:r>
-      <w:r>
-        <w:t xml:space="preserve"> </w:t>
-      </w:r>
-      <w:r>
-        <w:rPr>
-          <w:rStyle w:val="VerbatimChar"/>
+        <w:t xml:space="preserve">: one program per line, launched at boot, as</w:t>
+      </w:r>
+      <w:r>
+        <w:t xml:space="preserve"> </w:t>
+      </w:r>
+      <w:r>
+        <w:rPr>
+          <w:rStyle w:val="VerbatimChar"/>
+        </w:rPr>
+        <w:t xml:space="preserve">&lt;name&gt;[.app] [args…]</w:t>
+      </w:r>
+      <w:r>
+        <w:t xml:space="preserve">. A</w:t>
+      </w:r>
+      <w:r>
+        <w:t xml:space="preserve"> </w:t>
+      </w:r>
+      <w:r>
+        <w:rPr>
+          <w:rStyle w:val="VerbatimChar"/>
+          <w:b/>
+          <w:bCs/>
         </w:rPr>
         <w:t xml:space="preserve">.app</w:t>
       </w:r>
       <w:r>
-        <w:t xml:space="preserve">). By default</w:t>
-      </w:r>
-      <w:r>
-        <w:t xml:space="preserve"> </w:t>
-      </w:r>
-      <w:r>
-        <w:rPr>
-          <w:rStyle w:val="VerbatimChar"/>
-        </w:rPr>
-        <w:t xml:space="preserve">voronoy</w:t>
+        <w:t xml:space="preserve"> </w:t>
+      </w:r>
+      <w:r>
+        <w:t xml:space="preserve">name is a desktop app (</w:t>
+      </w:r>
+      <w:r>
+        <w:rPr>
+          <w:rStyle w:val="VerbatimChar"/>
+        </w:rPr>
+        <w:t xml:space="preserve">/apps/&lt;name&gt;/main.elf</w:t>
+      </w:r>
+      <w:r>
+        <w:t xml:space="preserve">);</w:t>
+      </w:r>
+      <w:r>
+        <w:t xml:space="preserve"> </w:t>
+      </w:r>
+      <w:r>
+        <w:t xml:space="preserve">a name</w:t>
+      </w:r>
+      <w:r>
+        <w:t xml:space="preserve"> </w:t>
+      </w:r>
+      <w:r>
+        <w:rPr>
+          <w:b/>
+          <w:bCs/>
+        </w:rPr>
+        <w:t xml:space="preserve">without an extension</w:t>
+      </w:r>
+      <w:r>
+        <w:t xml:space="preserve"> </w:t>
+      </w:r>
+      <w:r>
+        <w:t xml:space="preserve">is a</w:t>
+      </w:r>
+      <w:r>
+        <w:t xml:space="preserve"> </w:t>
+      </w:r>
+      <w:r>
+        <w:rPr>
+          <w:rStyle w:val="VerbatimChar"/>
+        </w:rPr>
+        <w:t xml:space="preserve">/bin</w:t>
+      </w:r>
+      <w:r>
+        <w:t xml:space="preserve"> </w:t>
+      </w:r>
+      <w:r>
+        <w:t xml:space="preserve">console tool (</w:t>
+      </w:r>
+      <w:r>
+        <w:rPr>
+          <w:rStyle w:val="VerbatimChar"/>
+        </w:rPr>
+        <w:t xml:space="preserve">/bin/&lt;name&gt;.elf</w:t>
+      </w:r>
+      <w:r>
+        <w:t xml:space="preserve">); the</w:t>
+      </w:r>
+      <w:r>
+        <w:t xml:space="preserve"> </w:t>
+      </w:r>
+      <w:r>
+        <w:t xml:space="preserve">rest of the line is passed as arguments. Defaults:</w:t>
+      </w:r>
+      <w:r>
+        <w:t xml:space="preserve"> </w:t>
+      </w:r>
+      <w:r>
+        <w:rPr>
+          <w:rStyle w:val="VerbatimChar"/>
+        </w:rPr>
+        <w:t xml:space="preserve">voronoy.app</w:t>
       </w:r>
       <w:r>
         <w:t xml:space="preserve"> </w:t>
@@ -7597,10 +7675,28 @@
         <w:rPr>
           <w:rStyle w:val="VerbatimChar"/>
         </w:rPr>
-        <w:t xml:space="preserve">panel</w:t>
-      </w:r>
-      <w:r>
-        <w:t xml:space="preserve">.</w:t>
+        <w:t xml:space="preserve">panel.app</w:t>
+      </w:r>
+      <w:r>
+        <w:t xml:space="preserve"> </w:t>
+      </w:r>
+      <w:r>
+        <w:t xml:space="preserve">(e.g. add</w:t>
+      </w:r>
+      <w:r>
+        <w:t xml:space="preserve"> </w:t>
+      </w:r>
+      <w:r>
+        <w:rPr>
+          <w:rStyle w:val="VerbatimChar"/>
+        </w:rPr>
+        <w:t xml:space="preserve">keyb FR</w:t>
+      </w:r>
+      <w:r>
+        <w:t xml:space="preserve"> </w:t>
+      </w:r>
+      <w:r>
+        <w:t xml:space="preserve">to set the keyboard layout at boot).</w:t>
       </w:r>
     </w:p>
     <w:p>

</xml_diff>